<commit_message>
refactor: align evaluators with SDLC layout and tooling
Rename legacy trees to pipd_eval, cmp_eval, and dmp_eval; standardize FastAPI routes as api/routes.py; refresh unified_eval_app and bundle/runner CLI paths; add tools/ helpers and gitignore rules for local eval outputs; fix PIPD API imports and GT path resolution.

Co-authored-by: Cursor <cursoragent@cursor.com>
</commit_message>
<xml_diff>
--- a/risk_profile_eval/outputs/Risk_Profile_Eval_Report_B7981027.docx
+++ b/risk_profile_eval/outputs/Risk_Profile_Eval_Report_B7981027.docx
@@ -69,7 +69,7 @@
           <w:i w:val="0"/>
           <w:sz w:val="22"/>
         </w:rPr>
-        <w:t>Eval date: 2026-04-15 | Generator: v1.0 | Config: 1.0</w:t>
+        <w:t>Eval date: 2026-04-27 | Generator: v1.0 | Config: 1.0</w:t>
       </w:r>
     </w:p>
     <w:p/>
@@ -216,7 +216,7 @@
         <w:tc>
           <w:tcPr>
             <w:tcW w:type="dxa" w:w="2880"/>
-            <w:shd w:fill="D9D9D9"/>
+            <w:shd w:fill="4472C4"/>
           </w:tcPr>
           <w:p>
             <w:pPr>
@@ -227,6 +227,7 @@
               <w:rPr>
                 <w:b/>
                 <w:i w:val="0"/>
+                <w:color w:val="FFFFFF"/>
                 <w:sz w:val="22"/>
               </w:rPr>
               <w:t>Metric</w:t>
@@ -236,7 +237,7 @@
         <w:tc>
           <w:tcPr>
             <w:tcW w:type="dxa" w:w="1224"/>
-            <w:shd w:fill="D9D9D9"/>
+            <w:shd w:fill="4472C4"/>
           </w:tcPr>
           <w:p>
             <w:pPr>
@@ -247,6 +248,7 @@
               <w:rPr>
                 <w:b/>
                 <w:i w:val="0"/>
+                <w:color w:val="FFFFFF"/>
                 <w:sz w:val="22"/>
               </w:rPr>
               <w:t>Score</w:t>
@@ -256,7 +258,7 @@
         <w:tc>
           <w:tcPr>
             <w:tcW w:type="dxa" w:w="1224"/>
-            <w:shd w:fill="D9D9D9"/>
+            <w:shd w:fill="4472C4"/>
           </w:tcPr>
           <w:p>
             <w:pPr>
@@ -267,6 +269,7 @@
               <w:rPr>
                 <w:b/>
                 <w:i w:val="0"/>
+                <w:color w:val="FFFFFF"/>
                 <w:sz w:val="22"/>
               </w:rPr>
               <w:t>Target</w:t>
@@ -276,7 +279,7 @@
         <w:tc>
           <w:tcPr>
             <w:tcW w:type="dxa" w:w="1368"/>
-            <w:shd w:fill="D9D9D9"/>
+            <w:shd w:fill="4472C4"/>
           </w:tcPr>
           <w:p>
             <w:pPr>
@@ -287,6 +290,7 @@
               <w:rPr>
                 <w:b/>
                 <w:i w:val="0"/>
+                <w:color w:val="FFFFFF"/>
                 <w:sz w:val="22"/>
               </w:rPr>
               <w:t>Pass/Fail</w:t>
@@ -296,7 +300,7 @@
         <w:tc>
           <w:tcPr>
             <w:tcW w:type="dxa" w:w="2808"/>
-            <w:shd w:fill="D9D9D9"/>
+            <w:shd w:fill="4472C4"/>
           </w:tcPr>
           <w:p>
             <w:pPr>
@@ -307,6 +311,7 @@
               <w:rPr>
                 <w:b/>
                 <w:i w:val="0"/>
+                <w:color w:val="FFFFFF"/>
                 <w:sz w:val="22"/>
               </w:rPr>
               <w:t>Source</w:t>
@@ -427,7 +432,7 @@
                 <w:i w:val="0"/>
                 <w:sz w:val="22"/>
               </w:rPr>
-              <w:t>M2 RPN tier accuracy</w:t>
+              <w:t>M2 RPN tier (±1)</w:t>
             </w:r>
           </w:p>
         </w:tc>
@@ -621,7 +626,7 @@
                 <w:i w:val="0"/>
                 <w:sz w:val="22"/>
               </w:rPr>
-              <w:t>M4 Hallucination detection</w:t>
+              <w:t>M4 Provenance defects</w:t>
             </w:r>
           </w:p>
         </w:tc>
@@ -640,7 +645,7 @@
                 <w:i w:val="0"/>
                 <w:sz w:val="22"/>
               </w:rPr>
-              <w:t>0</w:t>
+              <w:t>0 (semantic unmatched risks: 3)</w:t>
             </w:r>
           </w:p>
         </w:tc>
@@ -727,7 +732,7 @@
           <w:i w:val="0"/>
           <w:sz w:val="22"/>
         </w:rPr>
-        <w:t>One or more metrics did not pass. Document score 79.2 (threshold 75, target 80). See JSON for details.</w:t>
+        <w:t>One or more requirements did not pass. Document score 79.2 (threshold 75, target 80). See eval JSON for details.</w:t>
       </w:r>
     </w:p>
     <w:p>
@@ -785,7 +790,7 @@
         <w:tc>
           <w:tcPr>
             <w:tcW w:type="dxa" w:w="2880"/>
-            <w:shd w:fill="D9D9D9"/>
+            <w:shd w:fill="4472C4"/>
           </w:tcPr>
           <w:p>
             <w:pPr>
@@ -796,6 +801,7 @@
               <w:rPr>
                 <w:b/>
                 <w:i w:val="0"/>
+                <w:color w:val="FFFFFF"/>
                 <w:sz w:val="22"/>
               </w:rPr>
               <w:t>Risk Name</w:t>
@@ -805,7 +811,7 @@
         <w:tc>
           <w:tcPr>
             <w:tcW w:type="dxa" w:w="792"/>
-            <w:shd w:fill="D9D9D9"/>
+            <w:shd w:fill="4472C4"/>
           </w:tcPr>
           <w:p>
             <w:pPr>
@@ -816,6 +822,7 @@
               <w:rPr>
                 <w:b/>
                 <w:i w:val="0"/>
+                <w:color w:val="FFFFFF"/>
                 <w:sz w:val="22"/>
               </w:rPr>
               <w:t>Weight</w:t>
@@ -825,7 +832,7 @@
         <w:tc>
           <w:tcPr>
             <w:tcW w:type="dxa" w:w="936"/>
-            <w:shd w:fill="D9D9D9"/>
+            <w:shd w:fill="4472C4"/>
           </w:tcPr>
           <w:p>
             <w:pPr>
@@ -836,6 +843,7 @@
               <w:rPr>
                 <w:b/>
                 <w:i w:val="0"/>
+                <w:color w:val="FFFFFF"/>
                 <w:sz w:val="22"/>
               </w:rPr>
               <w:t>Risk Score</w:t>
@@ -845,7 +853,7 @@
         <w:tc>
           <w:tcPr>
             <w:tcW w:type="dxa" w:w="936"/>
-            <w:shd w:fill="D9D9D9"/>
+            <w:shd w:fill="4472C4"/>
           </w:tcPr>
           <w:p>
             <w:pPr>
@@ -856,6 +864,7 @@
               <w:rPr>
                 <w:b/>
                 <w:i w:val="0"/>
+                <w:color w:val="FFFFFF"/>
                 <w:sz w:val="22"/>
               </w:rPr>
               <w:t>Weighted</w:t>
@@ -865,7 +874,7 @@
         <w:tc>
           <w:tcPr>
             <w:tcW w:type="dxa" w:w="1080"/>
-            <w:shd w:fill="D9D9D9"/>
+            <w:shd w:fill="4472C4"/>
           </w:tcPr>
           <w:p>
             <w:pPr>
@@ -876,16 +885,17 @@
               <w:rPr>
                 <w:b/>
                 <w:i w:val="0"/>
+                <w:color w:val="FFFFFF"/>
                 <w:sz w:val="22"/>
               </w:rPr>
-              <w:t>RPN Match</w:t>
+              <w:t>RPN ±1</w:t>
             </w:r>
           </w:p>
         </w:tc>
         <w:tc>
           <w:tcPr>
             <w:tcW w:type="dxa" w:w="936"/>
-            <w:shd w:fill="D9D9D9"/>
+            <w:shd w:fill="4472C4"/>
           </w:tcPr>
           <w:p>
             <w:pPr>
@@ -896,6 +906,7 @@
               <w:rPr>
                 <w:b/>
                 <w:i w:val="0"/>
+                <w:color w:val="FFFFFF"/>
                 <w:sz w:val="22"/>
               </w:rPr>
               <w:t>Controls</w:t>
@@ -905,7 +916,7 @@
         <w:tc>
           <w:tcPr>
             <w:tcW w:type="dxa" w:w="1224"/>
-            <w:shd w:fill="D9D9D9"/>
+            <w:shd w:fill="4472C4"/>
           </w:tcPr>
           <w:p>
             <w:pPr>
@@ -916,6 +927,7 @@
               <w:rPr>
                 <w:b/>
                 <w:i w:val="0"/>
+                <w:color w:val="FFFFFF"/>
                 <w:sz w:val="22"/>
               </w:rPr>
               <w:t>Status</w:t>
@@ -977,7 +989,7 @@
                 <w:i w:val="0"/>
                 <w:sz w:val="22"/>
               </w:rPr>
-              <w:t>88.0</w:t>
+              <w:t>97.0</w:t>
             </w:r>
           </w:p>
         </w:tc>
@@ -996,7 +1008,7 @@
                 <w:i w:val="0"/>
                 <w:sz w:val="22"/>
               </w:rPr>
-              <w:t>29.33</w:t>
+              <w:t>32.33</w:t>
             </w:r>
           </w:p>
         </w:tc>
@@ -1351,7 +1363,7 @@
               <a:graphicData uri="http://schemas.openxmlformats.org/drawingml/2006/picture">
                 <pic:pic>
                   <pic:nvPicPr>
-                    <pic:cNvPr id="0" name="tmpu5ab3xq0.png"/>
+                    <pic:cNvPr id="0" name="tmpdp23i1of.png"/>
                     <pic:cNvPicPr/>
                   </pic:nvPicPr>
                   <pic:blipFill>
@@ -1394,109 +1406,229 @@
     </w:p>
     <w:p>
       <w:pPr>
-        <w:spacing w:lineRule="auto" w:line="276" w:after="120"/>
+        <w:pStyle w:val="Heading3"/>
       </w:pPr>
       <w:r>
-        <w:rPr>
-          <w:b/>
-          <w:i w:val="0"/>
-          <w:sz w:val="22"/>
-        </w:rPr>
-        <w:t>Risk Name Match</w:t>
+        <w:t>Risk match information</w:t>
       </w:r>
     </w:p>
+    <w:tbl>
+      <w:tblPr>
+        <w:tblStyle w:val="TableGrid"/>
+        <w:tblW w:type="auto" w:w="0"/>
+        <w:tblLayout w:type="fixed"/>
+        <w:tblLook w:firstColumn="1" w:firstRow="1" w:lastColumn="0" w:lastRow="0" w:noHBand="0" w:noVBand="1" w:val="04A0"/>
+      </w:tblPr>
+      <w:tblGrid>
+        <w:gridCol w:w="4320"/>
+        <w:gridCol w:w="4320"/>
+      </w:tblGrid>
+      <w:tr>
+        <w:tc>
+          <w:tcPr>
+            <w:tcW w:type="dxa" w:w="2088"/>
+            <w:shd w:fill="4472C4"/>
+          </w:tcPr>
+          <w:p>
+            <w:pPr>
+              <w:spacing w:lineRule="auto" w:line="276" w:after="120"/>
+            </w:pPr>
+            <w:r/>
+            <w:r>
+              <w:rPr>
+                <w:b/>
+                <w:color w:val="FFFFFF"/>
+                <w:sz w:val="22"/>
+              </w:rPr>
+              <w:t>Field</w:t>
+            </w:r>
+          </w:p>
+        </w:tc>
+        <w:tc>
+          <w:tcPr>
+            <w:tcW w:type="dxa" w:w="7272"/>
+            <w:shd w:fill="4472C4"/>
+          </w:tcPr>
+          <w:p>
+            <w:pPr>
+              <w:spacing w:lineRule="auto" w:line="276" w:after="120"/>
+            </w:pPr>
+            <w:r/>
+            <w:r>
+              <w:rPr>
+                <w:b/>
+                <w:color w:val="FFFFFF"/>
+                <w:sz w:val="22"/>
+              </w:rPr>
+              <w:t>Value</w:t>
+            </w:r>
+          </w:p>
+        </w:tc>
+      </w:tr>
+      <w:tr>
+        <w:tc>
+          <w:tcPr>
+            <w:tcW w:type="dxa" w:w="4320"/>
+          </w:tcPr>
+          <w:p>
+            <w:pPr>
+              <w:spacing w:lineRule="auto" w:line="276" w:after="120"/>
+            </w:pPr>
+            <w:r/>
+            <w:r>
+              <w:rPr>
+                <w:b/>
+                <w:sz w:val="22"/>
+              </w:rPr>
+              <w:t>Risk Name Match</w:t>
+            </w:r>
+          </w:p>
+        </w:tc>
+        <w:tc>
+          <w:tcPr>
+            <w:tcW w:type="dxa" w:w="4320"/>
+          </w:tcPr>
+          <w:p>
+            <w:pPr>
+              <w:spacing w:lineRule="auto" w:line="276" w:after="120"/>
+            </w:pPr>
+            <w:r/>
+            <w:r>
+              <w:rPr>
+                <w:b w:val="0"/>
+                <w:sz w:val="22"/>
+              </w:rPr>
+              <w:t>Participant / Caregiver Trial Conduct</w:t>
+            </w:r>
+          </w:p>
+        </w:tc>
+      </w:tr>
+      <w:tr>
+        <w:tc>
+          <w:tcPr>
+            <w:tcW w:type="dxa" w:w="4320"/>
+          </w:tcPr>
+          <w:p>
+            <w:pPr>
+              <w:spacing w:lineRule="auto" w:line="276" w:after="120"/>
+            </w:pPr>
+            <w:r/>
+            <w:r>
+              <w:rPr>
+                <w:b/>
+                <w:sz w:val="22"/>
+              </w:rPr>
+              <w:t>Match Status</w:t>
+            </w:r>
+          </w:p>
+        </w:tc>
+        <w:tc>
+          <w:tcPr>
+            <w:tcW w:type="dxa" w:w="4320"/>
+          </w:tcPr>
+          <w:p>
+            <w:pPr>
+              <w:spacing w:lineRule="auto" w:line="276" w:after="120"/>
+            </w:pPr>
+            <w:r/>
+            <w:r>
+              <w:rPr>
+                <w:b w:val="0"/>
+                <w:color w:val="006600"/>
+                <w:sz w:val="22"/>
+              </w:rPr>
+              <w:t>Verbatim ✓ | Levenshtein: 0</w:t>
+            </w:r>
+          </w:p>
+        </w:tc>
+      </w:tr>
+      <w:tr>
+        <w:tc>
+          <w:tcPr>
+            <w:tcW w:type="dxa" w:w="4320"/>
+          </w:tcPr>
+          <w:p>
+            <w:pPr>
+              <w:spacing w:lineRule="auto" w:line="276" w:after="120"/>
+            </w:pPr>
+            <w:r/>
+            <w:r>
+              <w:rPr>
+                <w:b/>
+                <w:sz w:val="22"/>
+              </w:rPr>
+              <w:t>Ground Truth ID</w:t>
+            </w:r>
+          </w:p>
+        </w:tc>
+        <w:tc>
+          <w:tcPr>
+            <w:tcW w:type="dxa" w:w="4320"/>
+          </w:tcPr>
+          <w:p>
+            <w:pPr>
+              <w:spacing w:lineRule="auto" w:line="276" w:after="120"/>
+            </w:pPr>
+            <w:r/>
+            <w:r>
+              <w:rPr>
+                <w:b w:val="0"/>
+                <w:sz w:val="22"/>
+              </w:rPr>
+              <w:t>SR-02224</w:t>
+            </w:r>
+          </w:p>
+        </w:tc>
+      </w:tr>
+      <w:tr>
+        <w:tc>
+          <w:tcPr>
+            <w:tcW w:type="dxa" w:w="4320"/>
+          </w:tcPr>
+          <w:p>
+            <w:pPr>
+              <w:spacing w:lineRule="auto" w:line="276" w:after="120"/>
+            </w:pPr>
+            <w:r/>
+            <w:r>
+              <w:rPr>
+                <w:b/>
+                <w:sz w:val="22"/>
+              </w:rPr>
+              <w:t>Risk Domain</w:t>
+            </w:r>
+          </w:p>
+        </w:tc>
+        <w:tc>
+          <w:tcPr>
+            <w:tcW w:type="dxa" w:w="4320"/>
+          </w:tcPr>
+          <w:p>
+            <w:pPr>
+              <w:spacing w:lineRule="auto" w:line="276" w:after="120"/>
+            </w:pPr>
+            <w:r/>
+            <w:r>
+              <w:rPr>
+                <w:b w:val="0"/>
+                <w:color w:val="006600"/>
+                <w:sz w:val="22"/>
+              </w:rPr>
+              <w:t>Study Risks</w:t>
+            </w:r>
+          </w:p>
+        </w:tc>
+      </w:tr>
+    </w:tbl>
+    <w:p/>
     <w:p>
       <w:pPr>
-        <w:spacing w:lineRule="auto" w:line="276" w:after="120"/>
+        <w:pStyle w:val="Heading3"/>
       </w:pPr>
       <w:r>
-        <w:rPr>
-          <w:b w:val="0"/>
-          <w:i w:val="0"/>
-          <w:sz w:val="22"/>
-        </w:rPr>
-        <w:t>Participant / Caregiver Trial Conduct</w:t>
+        <w:t>RPN components (generated vs ground truth)</w:t>
       </w:r>
     </w:p>
-    <w:p>
-      <w:pPr>
-        <w:spacing w:lineRule="auto" w:line="276" w:after="120"/>
-      </w:pPr>
-      <w:r>
-        <w:rPr>
-          <w:b/>
-          <w:i w:val="0"/>
-          <w:sz w:val="22"/>
-        </w:rPr>
-        <w:t>Match Status</w:t>
-      </w:r>
-    </w:p>
-    <w:p>
-      <w:pPr>
-        <w:spacing w:lineRule="auto" w:line="276" w:after="120"/>
-      </w:pPr>
-      <w:r>
-        <w:rPr>
-          <w:b w:val="0"/>
-          <w:i w:val="0"/>
-          <w:sz w:val="22"/>
-        </w:rPr>
-        <w:t>Verbatim ✓ | Levenshtein: 0</w:t>
-      </w:r>
-    </w:p>
-    <w:p>
-      <w:pPr>
-        <w:spacing w:lineRule="auto" w:line="276" w:after="120"/>
-      </w:pPr>
-      <w:r>
-        <w:rPr>
-          <w:b/>
-          <w:i w:val="0"/>
-          <w:sz w:val="22"/>
-        </w:rPr>
-        <w:t>Ground Truth ID</w:t>
-      </w:r>
-    </w:p>
-    <w:p>
-      <w:pPr>
-        <w:spacing w:lineRule="auto" w:line="276" w:after="120"/>
-      </w:pPr>
-      <w:r>
-        <w:rPr>
-          <w:b w:val="0"/>
-          <w:i w:val="0"/>
-          <w:sz w:val="22"/>
-        </w:rPr>
-        <w:t>SR-02224</w:t>
-      </w:r>
-    </w:p>
-    <w:p>
-      <w:pPr>
-        <w:spacing w:lineRule="auto" w:line="276" w:after="120"/>
-      </w:pPr>
-      <w:r>
-        <w:rPr>
-          <w:b/>
-          <w:i w:val="0"/>
-          <w:sz w:val="22"/>
-        </w:rPr>
-        <w:t>Risk Domain</w:t>
-      </w:r>
-    </w:p>
-    <w:p>
-      <w:pPr>
-        <w:spacing w:lineRule="auto" w:line="276" w:after="120"/>
-      </w:pPr>
-      <w:r>
-        <w:rPr>
-          <w:b w:val="0"/>
-          <w:i w:val="0"/>
-          <w:sz w:val="22"/>
-        </w:rPr>
-        <w:t>Study Risks</w:t>
-      </w:r>
-    </w:p>
-    <w:p/>
     <w:tbl>
       <w:tblPr>
         <w:tblStyle w:val="TableGrid"/>
@@ -1514,7 +1646,7 @@
         <w:tc>
           <w:tcPr>
             <w:tcW w:type="dxa" w:w="2304"/>
-            <w:shd w:fill="D9D9D9"/>
+            <w:shd w:fill="4472C4"/>
           </w:tcPr>
           <w:p>
             <w:pPr>
@@ -1524,7 +1656,7 @@
             <w:r>
               <w:rPr>
                 <w:b/>
-                <w:i w:val="0"/>
+                <w:color w:val="FFFFFF"/>
                 <w:sz w:val="22"/>
               </w:rPr>
               <w:t>Active RPN</w:t>
@@ -1534,7 +1666,7 @@
         <w:tc>
           <w:tcPr>
             <w:tcW w:type="dxa" w:w="1872"/>
-            <w:shd w:fill="D9D9D9"/>
+            <w:shd w:fill="4472C4"/>
           </w:tcPr>
           <w:p>
             <w:pPr>
@@ -1544,7 +1676,7 @@
             <w:r>
               <w:rPr>
                 <w:b/>
-                <w:i w:val="0"/>
+                <w:color w:val="FFFFFF"/>
                 <w:sz w:val="22"/>
               </w:rPr>
               <w:t>Impact</w:t>
@@ -1554,7 +1686,7 @@
         <w:tc>
           <w:tcPr>
             <w:tcW w:type="dxa" w:w="1872"/>
-            <w:shd w:fill="D9D9D9"/>
+            <w:shd w:fill="4472C4"/>
           </w:tcPr>
           <w:p>
             <w:pPr>
@@ -1564,7 +1696,7 @@
             <w:r>
               <w:rPr>
                 <w:b/>
-                <w:i w:val="0"/>
+                <w:color w:val="FFFFFF"/>
                 <w:sz w:val="22"/>
               </w:rPr>
               <w:t>Likelihood</w:t>
@@ -1574,7 +1706,7 @@
         <w:tc>
           <w:tcPr>
             <w:tcW w:type="dxa" w:w="1872"/>
-            <w:shd w:fill="D9D9D9"/>
+            <w:shd w:fill="4472C4"/>
           </w:tcPr>
           <w:p>
             <w:pPr>
@@ -1584,7 +1716,7 @@
             <w:r>
               <w:rPr>
                 <w:b/>
-                <w:i w:val="0"/>
+                <w:color w:val="FFFFFF"/>
                 <w:sz w:val="22"/>
               </w:rPr>
               <w:t>Detectability</w:t>
@@ -1595,7 +1727,7 @@
       <w:tr>
         <w:tc>
           <w:tcPr>
-            <w:tcW w:type="dxa" w:w="2304"/>
+            <w:tcW w:type="dxa" w:w="2160"/>
           </w:tcPr>
           <w:p>
             <w:pPr>
@@ -1605,7 +1737,7 @@
             <w:r>
               <w:rPr>
                 <w:b w:val="0"/>
-                <w:i w:val="0"/>
+                <w:color w:val="C00000"/>
                 <w:sz w:val="22"/>
               </w:rPr>
               <w:t>196 = 160 ✗</w:t>
@@ -1614,7 +1746,7 @@
         </w:tc>
         <w:tc>
           <w:tcPr>
-            <w:tcW w:type="dxa" w:w="1872"/>
+            <w:tcW w:type="dxa" w:w="2160"/>
           </w:tcPr>
           <w:p>
             <w:pPr>
@@ -1624,7 +1756,7 @@
             <w:r>
               <w:rPr>
                 <w:b w:val="0"/>
-                <w:i w:val="0"/>
+                <w:color w:val="C00000"/>
                 <w:sz w:val="22"/>
               </w:rPr>
               <w:t>7 = 10 ✗</w:t>
@@ -1633,7 +1765,7 @@
         </w:tc>
         <w:tc>
           <w:tcPr>
-            <w:tcW w:type="dxa" w:w="1872"/>
+            <w:tcW w:type="dxa" w:w="2160"/>
           </w:tcPr>
           <w:p>
             <w:pPr>
@@ -1643,7 +1775,7 @@
             <w:r>
               <w:rPr>
                 <w:b w:val="0"/>
-                <w:i w:val="0"/>
+                <w:color w:val="C00000"/>
                 <w:sz w:val="22"/>
               </w:rPr>
               <w:t>7 = 4 ✗</w:t>
@@ -1652,7 +1784,7 @@
         </w:tc>
         <w:tc>
           <w:tcPr>
-            <w:tcW w:type="dxa" w:w="1872"/>
+            <w:tcW w:type="dxa" w:w="2160"/>
           </w:tcPr>
           <w:p>
             <w:pPr>
@@ -1662,7 +1794,7 @@
             <w:r>
               <w:rPr>
                 <w:b w:val="0"/>
-                <w:i w:val="0"/>
+                <w:color w:val="006600"/>
                 <w:sz w:val="22"/>
               </w:rPr>
               <w:t>4 = 4 ✓</w:t>
@@ -1673,6 +1805,14 @@
     </w:tbl>
     <w:p/>
     <w:p/>
+    <w:p>
+      <w:pPr>
+        <w:pStyle w:val="Heading3"/>
+      </w:pPr>
+      <w:r>
+        <w:t>Attribute comparison</w:t>
+      </w:r>
+    </w:p>
     <w:tbl>
       <w:tblPr>
         <w:tblStyle w:val="TableGrid"/>
@@ -1691,7 +1831,7 @@
         <w:tc>
           <w:tcPr>
             <w:tcW w:type="dxa" w:w="1656"/>
-            <w:shd w:fill="D9D9D9"/>
+            <w:shd w:fill="4472C4"/>
           </w:tcPr>
           <w:p>
             <w:pPr>
@@ -1701,7 +1841,7 @@
             <w:r>
               <w:rPr>
                 <w:b/>
-                <w:i w:val="0"/>
+                <w:color w:val="FFFFFF"/>
                 <w:sz w:val="22"/>
               </w:rPr>
               <w:t>Attribute</w:t>
@@ -1711,7 +1851,7 @@
         <w:tc>
           <w:tcPr>
             <w:tcW w:type="dxa" w:w="792"/>
-            <w:shd w:fill="D9D9D9"/>
+            <w:shd w:fill="4472C4"/>
           </w:tcPr>
           <w:p>
             <w:pPr>
@@ -1721,7 +1861,7 @@
             <w:r>
               <w:rPr>
                 <w:b/>
-                <w:i w:val="0"/>
+                <w:color w:val="FFFFFF"/>
                 <w:sz w:val="22"/>
               </w:rPr>
               <w:t>Score</w:t>
@@ -1731,7 +1871,7 @@
         <w:tc>
           <w:tcPr>
             <w:tcW w:type="dxa" w:w="1224"/>
-            <w:shd w:fill="D9D9D9"/>
+            <w:shd w:fill="4472C4"/>
           </w:tcPr>
           <w:p>
             <w:pPr>
@@ -1741,7 +1881,7 @@
             <w:r>
               <w:rPr>
                 <w:b/>
-                <w:i w:val="0"/>
+                <w:color w:val="FFFFFF"/>
                 <w:sz w:val="22"/>
               </w:rPr>
               <w:t>Match Type</w:t>
@@ -1751,7 +1891,7 @@
         <w:tc>
           <w:tcPr>
             <w:tcW w:type="dxa" w:w="2520"/>
-            <w:shd w:fill="D9D9D9"/>
+            <w:shd w:fill="4472C4"/>
           </w:tcPr>
           <w:p>
             <w:pPr>
@@ -1761,7 +1901,7 @@
             <w:r>
               <w:rPr>
                 <w:b/>
-                <w:i w:val="0"/>
+                <w:color w:val="FFFFFF"/>
                 <w:sz w:val="22"/>
               </w:rPr>
               <w:t>Generated</w:t>
@@ -1771,7 +1911,7 @@
         <w:tc>
           <w:tcPr>
             <w:tcW w:type="dxa" w:w="2520"/>
-            <w:shd w:fill="D9D9D9"/>
+            <w:shd w:fill="4472C4"/>
           </w:tcPr>
           <w:p>
             <w:pPr>
@@ -1781,7 +1921,7 @@
             <w:r>
               <w:rPr>
                 <w:b/>
-                <w:i w:val="0"/>
+                <w:color w:val="FFFFFF"/>
                 <w:sz w:val="22"/>
               </w:rPr>
               <w:t>Ground Truth</w:t>
@@ -1802,7 +1942,6 @@
             <w:r>
               <w:rPr>
                 <w:b w:val="0"/>
-                <w:i w:val="0"/>
                 <w:sz w:val="22"/>
               </w:rPr>
               <w:t>Risk name</w:t>
@@ -1821,7 +1960,7 @@
             <w:r>
               <w:rPr>
                 <w:b w:val="0"/>
-                <w:i w:val="0"/>
+                <w:color w:val="006600"/>
                 <w:sz w:val="22"/>
               </w:rPr>
               <w:t>1.00</w:t>
@@ -1840,7 +1979,6 @@
             <w:r>
               <w:rPr>
                 <w:b w:val="0"/>
-                <w:i w:val="0"/>
                 <w:sz w:val="22"/>
               </w:rPr>
               <w:t>verbatim</w:t>
@@ -1859,7 +1997,6 @@
             <w:r>
               <w:rPr>
                 <w:b w:val="0"/>
-                <w:i w:val="0"/>
                 <w:sz w:val="22"/>
               </w:rPr>
               <w:t>Participant / Caregiver Trial Conduct</w:t>
@@ -1878,7 +2015,6 @@
             <w:r>
               <w:rPr>
                 <w:b w:val="0"/>
-                <w:i w:val="0"/>
                 <w:sz w:val="22"/>
               </w:rPr>
               <w:t>Participant / Caregiver Trial Conduct</w:t>
@@ -1899,7 +2035,6 @@
             <w:r>
               <w:rPr>
                 <w:b w:val="0"/>
-                <w:i w:val="0"/>
                 <w:sz w:val="22"/>
               </w:rPr>
               <w:t>RPN</w:t>
@@ -1918,7 +2053,7 @@
             <w:r>
               <w:rPr>
                 <w:b w:val="0"/>
-                <w:i w:val="0"/>
+                <w:color w:val="006600"/>
                 <w:sz w:val="22"/>
               </w:rPr>
               <w:t>1.00</w:t>
@@ -1937,10 +2072,9 @@
             <w:r>
               <w:rPr>
                 <w:b w:val="0"/>
-                <w:i w:val="0"/>
                 <w:sz w:val="22"/>
               </w:rPr>
-              <w:t>tier</w:t>
+              <w:t>±1 tier</w:t>
             </w:r>
           </w:p>
         </w:tc>
@@ -1956,10 +2090,9 @@
             <w:r>
               <w:rPr>
                 <w:b w:val="0"/>
-                <w:i w:val="0"/>
                 <w:sz w:val="22"/>
               </w:rPr>
-              <w:t>196</w:t>
+              <w:t>196 (Tier 3)</w:t>
             </w:r>
           </w:p>
         </w:tc>
@@ -1975,10 +2108,9 @@
             <w:r>
               <w:rPr>
                 <w:b w:val="0"/>
-                <w:i w:val="0"/>
                 <w:sz w:val="22"/>
               </w:rPr>
-              <w:t>160</w:t>
+              <w:t>160 (Tier 2)</w:t>
             </w:r>
           </w:p>
         </w:tc>
@@ -1996,7 +2128,6 @@
             <w:r>
               <w:rPr>
                 <w:b w:val="0"/>
-                <w:i w:val="0"/>
                 <w:sz w:val="22"/>
               </w:rPr>
               <w:t>Risk domain</w:t>
@@ -2015,7 +2146,7 @@
             <w:r>
               <w:rPr>
                 <w:b w:val="0"/>
-                <w:i w:val="0"/>
+                <w:color w:val="006600"/>
                 <w:sz w:val="22"/>
               </w:rPr>
               <w:t>1.00</w:t>
@@ -2034,7 +2165,6 @@
             <w:r>
               <w:rPr>
                 <w:b w:val="0"/>
-                <w:i w:val="0"/>
                 <w:sz w:val="22"/>
               </w:rPr>
               <w:t>exact</w:t>
@@ -2053,7 +2183,6 @@
             <w:r>
               <w:rPr>
                 <w:b w:val="0"/>
-                <w:i w:val="0"/>
                 <w:sz w:val="22"/>
               </w:rPr>
               <w:t>Study Risks</w:t>
@@ -2072,7 +2201,6 @@
             <w:r>
               <w:rPr>
                 <w:b w:val="0"/>
-                <w:i w:val="0"/>
                 <w:sz w:val="22"/>
               </w:rPr>
               <w:t>Study Risks</w:t>
@@ -2093,7 +2221,6 @@
             <w:r>
               <w:rPr>
                 <w:b w:val="0"/>
-                <w:i w:val="0"/>
                 <w:sz w:val="22"/>
               </w:rPr>
               <w:t>Primary control type</w:t>
@@ -2112,7 +2239,7 @@
             <w:r>
               <w:rPr>
                 <w:b w:val="0"/>
-                <w:i w:val="0"/>
+                <w:color w:val="C00000"/>
                 <w:sz w:val="22"/>
               </w:rPr>
               <w:t>0.00</w:t>
@@ -2131,7 +2258,6 @@
             <w:r>
               <w:rPr>
                 <w:b w:val="0"/>
-                <w:i w:val="0"/>
                 <w:sz w:val="22"/>
               </w:rPr>
               <w:t>miss</w:t>
@@ -2150,7 +2276,6 @@
             <w:r>
               <w:rPr>
                 <w:b w:val="0"/>
-                <w:i w:val="0"/>
                 <w:sz w:val="22"/>
               </w:rPr>
               <w:t>Routine Review and Remediation of metrics for loss to follow up (QTL/KRI)</w:t>
@@ -2169,7 +2294,6 @@
             <w:r>
               <w:rPr>
                 <w:b w:val="0"/>
-                <w:i w:val="0"/>
                 <w:sz w:val="22"/>
               </w:rPr>
               <w:t>Quality Tolerance Limit (QTL)</w:t>
@@ -2182,36 +2306,6 @@
     <w:p/>
     <w:p>
       <w:pPr>
-        <w:spacing w:lineRule="auto" w:line="276" w:after="120"/>
-      </w:pPr>
-      <w:r>
-        <w:rPr>
-          <w:b/>
-          <w:i w:val="0"/>
-          <w:sz w:val="22"/>
-        </w:rPr>
-        <w:t>Intelligence block</w:t>
-      </w:r>
-    </w:p>
-    <w:p>
-      <w:pPr>
-        <w:spacing w:lineRule="auto" w:line="276" w:after="120"/>
-      </w:pPr>
-      <w:r>
-        <w:rPr>
-          <w:b w:val="0"/>
-          <w:i w:val="0"/>
-          <w:sz w:val="22"/>
-        </w:rPr>
-        <w:t>Benchmark occurrence rate: 100% | Source: 2/2 studies</w:t>
-        <w:br/>
-        <w:br/>
-        <w:t>RPN confidence: LOW | USDM traceability: FULL</w:t>
-      </w:r>
-    </w:p>
-    <w:p/>
-    <w:p>
-      <w:pPr>
         <w:pStyle w:val="Heading2"/>
       </w:pPr>
       <w:r>
@@ -2220,109 +2314,229 @@
     </w:p>
     <w:p>
       <w:pPr>
-        <w:spacing w:lineRule="auto" w:line="276" w:after="120"/>
+        <w:pStyle w:val="Heading3"/>
       </w:pPr>
       <w:r>
-        <w:rPr>
-          <w:b/>
-          <w:i w:val="0"/>
-          <w:sz w:val="22"/>
-        </w:rPr>
-        <w:t>Risk Name Match</w:t>
+        <w:t>Risk match information</w:t>
       </w:r>
     </w:p>
+    <w:tbl>
+      <w:tblPr>
+        <w:tblStyle w:val="TableGrid"/>
+        <w:tblW w:type="auto" w:w="0"/>
+        <w:tblLayout w:type="fixed"/>
+        <w:tblLook w:firstColumn="1" w:firstRow="1" w:lastColumn="0" w:lastRow="0" w:noHBand="0" w:noVBand="1" w:val="04A0"/>
+      </w:tblPr>
+      <w:tblGrid>
+        <w:gridCol w:w="4320"/>
+        <w:gridCol w:w="4320"/>
+      </w:tblGrid>
+      <w:tr>
+        <w:tc>
+          <w:tcPr>
+            <w:tcW w:type="dxa" w:w="2088"/>
+            <w:shd w:fill="4472C4"/>
+          </w:tcPr>
+          <w:p>
+            <w:pPr>
+              <w:spacing w:lineRule="auto" w:line="276" w:after="120"/>
+            </w:pPr>
+            <w:r/>
+            <w:r>
+              <w:rPr>
+                <w:b/>
+                <w:color w:val="FFFFFF"/>
+                <w:sz w:val="22"/>
+              </w:rPr>
+              <w:t>Field</w:t>
+            </w:r>
+          </w:p>
+        </w:tc>
+        <w:tc>
+          <w:tcPr>
+            <w:tcW w:type="dxa" w:w="7272"/>
+            <w:shd w:fill="4472C4"/>
+          </w:tcPr>
+          <w:p>
+            <w:pPr>
+              <w:spacing w:lineRule="auto" w:line="276" w:after="120"/>
+            </w:pPr>
+            <w:r/>
+            <w:r>
+              <w:rPr>
+                <w:b/>
+                <w:color w:val="FFFFFF"/>
+                <w:sz w:val="22"/>
+              </w:rPr>
+              <w:t>Value</w:t>
+            </w:r>
+          </w:p>
+        </w:tc>
+      </w:tr>
+      <w:tr>
+        <w:tc>
+          <w:tcPr>
+            <w:tcW w:type="dxa" w:w="4320"/>
+          </w:tcPr>
+          <w:p>
+            <w:pPr>
+              <w:spacing w:lineRule="auto" w:line="276" w:after="120"/>
+            </w:pPr>
+            <w:r/>
+            <w:r>
+              <w:rPr>
+                <w:b/>
+                <w:sz w:val="22"/>
+              </w:rPr>
+              <w:t>Risk Name Match</w:t>
+            </w:r>
+          </w:p>
+        </w:tc>
+        <w:tc>
+          <w:tcPr>
+            <w:tcW w:type="dxa" w:w="4320"/>
+          </w:tcPr>
+          <w:p>
+            <w:pPr>
+              <w:spacing w:lineRule="auto" w:line="276" w:after="120"/>
+            </w:pPr>
+            <w:r/>
+            <w:r>
+              <w:rPr>
+                <w:b w:val="0"/>
+                <w:sz w:val="22"/>
+              </w:rPr>
+              <w:t>Concomitant Medication Management</w:t>
+            </w:r>
+          </w:p>
+        </w:tc>
+      </w:tr>
+      <w:tr>
+        <w:tc>
+          <w:tcPr>
+            <w:tcW w:type="dxa" w:w="4320"/>
+          </w:tcPr>
+          <w:p>
+            <w:pPr>
+              <w:spacing w:lineRule="auto" w:line="276" w:after="120"/>
+            </w:pPr>
+            <w:r/>
+            <w:r>
+              <w:rPr>
+                <w:b/>
+                <w:sz w:val="22"/>
+              </w:rPr>
+              <w:t>Match Status</w:t>
+            </w:r>
+          </w:p>
+        </w:tc>
+        <w:tc>
+          <w:tcPr>
+            <w:tcW w:type="dxa" w:w="4320"/>
+          </w:tcPr>
+          <w:p>
+            <w:pPr>
+              <w:spacing w:lineRule="auto" w:line="276" w:after="120"/>
+            </w:pPr>
+            <w:r/>
+            <w:r>
+              <w:rPr>
+                <w:b w:val="0"/>
+                <w:color w:val="006600"/>
+                <w:sz w:val="22"/>
+              </w:rPr>
+              <w:t>Verbatim ✓ | Levenshtein: 0</w:t>
+            </w:r>
+          </w:p>
+        </w:tc>
+      </w:tr>
+      <w:tr>
+        <w:tc>
+          <w:tcPr>
+            <w:tcW w:type="dxa" w:w="4320"/>
+          </w:tcPr>
+          <w:p>
+            <w:pPr>
+              <w:spacing w:lineRule="auto" w:line="276" w:after="120"/>
+            </w:pPr>
+            <w:r/>
+            <w:r>
+              <w:rPr>
+                <w:b/>
+                <w:sz w:val="22"/>
+              </w:rPr>
+              <w:t>Ground Truth ID</w:t>
+            </w:r>
+          </w:p>
+        </w:tc>
+        <w:tc>
+          <w:tcPr>
+            <w:tcW w:type="dxa" w:w="4320"/>
+          </w:tcPr>
+          <w:p>
+            <w:pPr>
+              <w:spacing w:lineRule="auto" w:line="276" w:after="120"/>
+            </w:pPr>
+            <w:r/>
+            <w:r>
+              <w:rPr>
+                <w:b w:val="0"/>
+                <w:sz w:val="22"/>
+              </w:rPr>
+              <w:t>SR-02216</w:t>
+            </w:r>
+          </w:p>
+        </w:tc>
+      </w:tr>
+      <w:tr>
+        <w:tc>
+          <w:tcPr>
+            <w:tcW w:type="dxa" w:w="4320"/>
+          </w:tcPr>
+          <w:p>
+            <w:pPr>
+              <w:spacing w:lineRule="auto" w:line="276" w:after="120"/>
+            </w:pPr>
+            <w:r/>
+            <w:r>
+              <w:rPr>
+                <w:b/>
+                <w:sz w:val="22"/>
+              </w:rPr>
+              <w:t>Risk Domain</w:t>
+            </w:r>
+          </w:p>
+        </w:tc>
+        <w:tc>
+          <w:tcPr>
+            <w:tcW w:type="dxa" w:w="4320"/>
+          </w:tcPr>
+          <w:p>
+            <w:pPr>
+              <w:spacing w:lineRule="auto" w:line="276" w:after="120"/>
+            </w:pPr>
+            <w:r/>
+            <w:r>
+              <w:rPr>
+                <w:b w:val="0"/>
+                <w:color w:val="006600"/>
+                <w:sz w:val="22"/>
+              </w:rPr>
+              <w:t>Study Risks</w:t>
+            </w:r>
+          </w:p>
+        </w:tc>
+      </w:tr>
+    </w:tbl>
+    <w:p/>
     <w:p>
       <w:pPr>
-        <w:spacing w:lineRule="auto" w:line="276" w:after="120"/>
+        <w:pStyle w:val="Heading3"/>
       </w:pPr>
       <w:r>
-        <w:rPr>
-          <w:b w:val="0"/>
-          <w:i w:val="0"/>
-          <w:sz w:val="22"/>
-        </w:rPr>
-        <w:t>Concomitant Medication Management</w:t>
+        <w:t>RPN components (generated vs ground truth)</w:t>
       </w:r>
     </w:p>
-    <w:p>
-      <w:pPr>
-        <w:spacing w:lineRule="auto" w:line="276" w:after="120"/>
-      </w:pPr>
-      <w:r>
-        <w:rPr>
-          <w:b/>
-          <w:i w:val="0"/>
-          <w:sz w:val="22"/>
-        </w:rPr>
-        <w:t>Match Status</w:t>
-      </w:r>
-    </w:p>
-    <w:p>
-      <w:pPr>
-        <w:spacing w:lineRule="auto" w:line="276" w:after="120"/>
-      </w:pPr>
-      <w:r>
-        <w:rPr>
-          <w:b w:val="0"/>
-          <w:i w:val="0"/>
-          <w:sz w:val="22"/>
-        </w:rPr>
-        <w:t>Verbatim ✓ | Levenshtein: 0</w:t>
-      </w:r>
-    </w:p>
-    <w:p>
-      <w:pPr>
-        <w:spacing w:lineRule="auto" w:line="276" w:after="120"/>
-      </w:pPr>
-      <w:r>
-        <w:rPr>
-          <w:b/>
-          <w:i w:val="0"/>
-          <w:sz w:val="22"/>
-        </w:rPr>
-        <w:t>Ground Truth ID</w:t>
-      </w:r>
-    </w:p>
-    <w:p>
-      <w:pPr>
-        <w:spacing w:lineRule="auto" w:line="276" w:after="120"/>
-      </w:pPr>
-      <w:r>
-        <w:rPr>
-          <w:b w:val="0"/>
-          <w:i w:val="0"/>
-          <w:sz w:val="22"/>
-        </w:rPr>
-        <w:t>SR-02216</w:t>
-      </w:r>
-    </w:p>
-    <w:p>
-      <w:pPr>
-        <w:spacing w:lineRule="auto" w:line="276" w:after="120"/>
-      </w:pPr>
-      <w:r>
-        <w:rPr>
-          <w:b/>
-          <w:i w:val="0"/>
-          <w:sz w:val="22"/>
-        </w:rPr>
-        <w:t>Risk Domain</w:t>
-      </w:r>
-    </w:p>
-    <w:p>
-      <w:pPr>
-        <w:spacing w:lineRule="auto" w:line="276" w:after="120"/>
-      </w:pPr>
-      <w:r>
-        <w:rPr>
-          <w:b w:val="0"/>
-          <w:i w:val="0"/>
-          <w:sz w:val="22"/>
-        </w:rPr>
-        <w:t>Study Risks</w:t>
-      </w:r>
-    </w:p>
-    <w:p/>
     <w:tbl>
       <w:tblPr>
         <w:tblStyle w:val="TableGrid"/>
@@ -2340,7 +2554,7 @@
         <w:tc>
           <w:tcPr>
             <w:tcW w:type="dxa" w:w="2304"/>
-            <w:shd w:fill="D9D9D9"/>
+            <w:shd w:fill="4472C4"/>
           </w:tcPr>
           <w:p>
             <w:pPr>
@@ -2350,7 +2564,7 @@
             <w:r>
               <w:rPr>
                 <w:b/>
-                <w:i w:val="0"/>
+                <w:color w:val="FFFFFF"/>
                 <w:sz w:val="22"/>
               </w:rPr>
               <w:t>Active RPN</w:t>
@@ -2360,7 +2574,7 @@
         <w:tc>
           <w:tcPr>
             <w:tcW w:type="dxa" w:w="1872"/>
-            <w:shd w:fill="D9D9D9"/>
+            <w:shd w:fill="4472C4"/>
           </w:tcPr>
           <w:p>
             <w:pPr>
@@ -2370,7 +2584,7 @@
             <w:r>
               <w:rPr>
                 <w:b/>
-                <w:i w:val="0"/>
+                <w:color w:val="FFFFFF"/>
                 <w:sz w:val="22"/>
               </w:rPr>
               <w:t>Impact</w:t>
@@ -2380,7 +2594,7 @@
         <w:tc>
           <w:tcPr>
             <w:tcW w:type="dxa" w:w="1872"/>
-            <w:shd w:fill="D9D9D9"/>
+            <w:shd w:fill="4472C4"/>
           </w:tcPr>
           <w:p>
             <w:pPr>
@@ -2390,7 +2604,7 @@
             <w:r>
               <w:rPr>
                 <w:b/>
-                <w:i w:val="0"/>
+                <w:color w:val="FFFFFF"/>
                 <w:sz w:val="22"/>
               </w:rPr>
               <w:t>Likelihood</w:t>
@@ -2400,7 +2614,7 @@
         <w:tc>
           <w:tcPr>
             <w:tcW w:type="dxa" w:w="1872"/>
-            <w:shd w:fill="D9D9D9"/>
+            <w:shd w:fill="4472C4"/>
           </w:tcPr>
           <w:p>
             <w:pPr>
@@ -2410,7 +2624,7 @@
             <w:r>
               <w:rPr>
                 <w:b/>
-                <w:i w:val="0"/>
+                <w:color w:val="FFFFFF"/>
                 <w:sz w:val="22"/>
               </w:rPr>
               <w:t>Detectability</w:t>
@@ -2421,7 +2635,7 @@
       <w:tr>
         <w:tc>
           <w:tcPr>
-            <w:tcW w:type="dxa" w:w="2304"/>
+            <w:tcW w:type="dxa" w:w="2160"/>
           </w:tcPr>
           <w:p>
             <w:pPr>
@@ -2431,7 +2645,7 @@
             <w:r>
               <w:rPr>
                 <w:b w:val="0"/>
-                <w:i w:val="0"/>
+                <w:color w:val="C00000"/>
                 <w:sz w:val="22"/>
               </w:rPr>
               <w:t>196 = 112 ✗</w:t>
@@ -2440,7 +2654,7 @@
         </w:tc>
         <w:tc>
           <w:tcPr>
-            <w:tcW w:type="dxa" w:w="1872"/>
+            <w:tcW w:type="dxa" w:w="2160"/>
           </w:tcPr>
           <w:p>
             <w:pPr>
@@ -2450,7 +2664,7 @@
             <w:r>
               <w:rPr>
                 <w:b w:val="0"/>
-                <w:i w:val="0"/>
+                <w:color w:val="006600"/>
                 <w:sz w:val="22"/>
               </w:rPr>
               <w:t>7 = 7 ✓</w:t>
@@ -2459,7 +2673,7 @@
         </w:tc>
         <w:tc>
           <w:tcPr>
-            <w:tcW w:type="dxa" w:w="1872"/>
+            <w:tcW w:type="dxa" w:w="2160"/>
           </w:tcPr>
           <w:p>
             <w:pPr>
@@ -2469,7 +2683,7 @@
             <w:r>
               <w:rPr>
                 <w:b w:val="0"/>
-                <w:i w:val="0"/>
+                <w:color w:val="C00000"/>
                 <w:sz w:val="22"/>
               </w:rPr>
               <w:t>7 = 4 ✗</w:t>
@@ -2478,7 +2692,7 @@
         </w:tc>
         <w:tc>
           <w:tcPr>
-            <w:tcW w:type="dxa" w:w="1872"/>
+            <w:tcW w:type="dxa" w:w="2160"/>
           </w:tcPr>
           <w:p>
             <w:pPr>
@@ -2488,7 +2702,7 @@
             <w:r>
               <w:rPr>
                 <w:b w:val="0"/>
-                <w:i w:val="0"/>
+                <w:color w:val="006600"/>
                 <w:sz w:val="22"/>
               </w:rPr>
               <w:t>4 = 4 ✓</w:t>
@@ -2499,6 +2713,14 @@
     </w:tbl>
     <w:p/>
     <w:p/>
+    <w:p>
+      <w:pPr>
+        <w:pStyle w:val="Heading3"/>
+      </w:pPr>
+      <w:r>
+        <w:t>Attribute comparison</w:t>
+      </w:r>
+    </w:p>
     <w:tbl>
       <w:tblPr>
         <w:tblStyle w:val="TableGrid"/>
@@ -2517,7 +2739,7 @@
         <w:tc>
           <w:tcPr>
             <w:tcW w:type="dxa" w:w="1656"/>
-            <w:shd w:fill="D9D9D9"/>
+            <w:shd w:fill="4472C4"/>
           </w:tcPr>
           <w:p>
             <w:pPr>
@@ -2527,7 +2749,7 @@
             <w:r>
               <w:rPr>
                 <w:b/>
-                <w:i w:val="0"/>
+                <w:color w:val="FFFFFF"/>
                 <w:sz w:val="22"/>
               </w:rPr>
               <w:t>Attribute</w:t>
@@ -2537,7 +2759,7 @@
         <w:tc>
           <w:tcPr>
             <w:tcW w:type="dxa" w:w="792"/>
-            <w:shd w:fill="D9D9D9"/>
+            <w:shd w:fill="4472C4"/>
           </w:tcPr>
           <w:p>
             <w:pPr>
@@ -2547,7 +2769,7 @@
             <w:r>
               <w:rPr>
                 <w:b/>
-                <w:i w:val="0"/>
+                <w:color w:val="FFFFFF"/>
                 <w:sz w:val="22"/>
               </w:rPr>
               <w:t>Score</w:t>
@@ -2557,7 +2779,7 @@
         <w:tc>
           <w:tcPr>
             <w:tcW w:type="dxa" w:w="1224"/>
-            <w:shd w:fill="D9D9D9"/>
+            <w:shd w:fill="4472C4"/>
           </w:tcPr>
           <w:p>
             <w:pPr>
@@ -2567,7 +2789,7 @@
             <w:r>
               <w:rPr>
                 <w:b/>
-                <w:i w:val="0"/>
+                <w:color w:val="FFFFFF"/>
                 <w:sz w:val="22"/>
               </w:rPr>
               <w:t>Match Type</w:t>
@@ -2577,7 +2799,7 @@
         <w:tc>
           <w:tcPr>
             <w:tcW w:type="dxa" w:w="2520"/>
-            <w:shd w:fill="D9D9D9"/>
+            <w:shd w:fill="4472C4"/>
           </w:tcPr>
           <w:p>
             <w:pPr>
@@ -2587,7 +2809,7 @@
             <w:r>
               <w:rPr>
                 <w:b/>
-                <w:i w:val="0"/>
+                <w:color w:val="FFFFFF"/>
                 <w:sz w:val="22"/>
               </w:rPr>
               <w:t>Generated</w:t>
@@ -2597,7 +2819,7 @@
         <w:tc>
           <w:tcPr>
             <w:tcW w:type="dxa" w:w="2520"/>
-            <w:shd w:fill="D9D9D9"/>
+            <w:shd w:fill="4472C4"/>
           </w:tcPr>
           <w:p>
             <w:pPr>
@@ -2607,7 +2829,7 @@
             <w:r>
               <w:rPr>
                 <w:b/>
-                <w:i w:val="0"/>
+                <w:color w:val="FFFFFF"/>
                 <w:sz w:val="22"/>
               </w:rPr>
               <w:t>Ground Truth</w:t>
@@ -2628,7 +2850,6 @@
             <w:r>
               <w:rPr>
                 <w:b w:val="0"/>
-                <w:i w:val="0"/>
                 <w:sz w:val="22"/>
               </w:rPr>
               <w:t>Risk name</w:t>
@@ -2647,7 +2868,7 @@
             <w:r>
               <w:rPr>
                 <w:b w:val="0"/>
-                <w:i w:val="0"/>
+                <w:color w:val="006600"/>
                 <w:sz w:val="22"/>
               </w:rPr>
               <w:t>1.00</w:t>
@@ -2666,7 +2887,6 @@
             <w:r>
               <w:rPr>
                 <w:b w:val="0"/>
-                <w:i w:val="0"/>
                 <w:sz w:val="22"/>
               </w:rPr>
               <w:t>verbatim</w:t>
@@ -2685,7 +2905,6 @@
             <w:r>
               <w:rPr>
                 <w:b w:val="0"/>
-                <w:i w:val="0"/>
                 <w:sz w:val="22"/>
               </w:rPr>
               <w:t>Concomitant Medication Management</w:t>
@@ -2704,7 +2923,6 @@
             <w:r>
               <w:rPr>
                 <w:b w:val="0"/>
-                <w:i w:val="0"/>
                 <w:sz w:val="22"/>
               </w:rPr>
               <w:t>Concomitant Medication Management</w:t>
@@ -2725,7 +2943,6 @@
             <w:r>
               <w:rPr>
                 <w:b w:val="0"/>
-                <w:i w:val="0"/>
                 <w:sz w:val="22"/>
               </w:rPr>
               <w:t>RPN</w:t>
@@ -2744,7 +2961,7 @@
             <w:r>
               <w:rPr>
                 <w:b w:val="0"/>
-                <w:i w:val="0"/>
+                <w:color w:val="C00000"/>
                 <w:sz w:val="22"/>
               </w:rPr>
               <w:t>0.00</w:t>
@@ -2763,10 +2980,9 @@
             <w:r>
               <w:rPr>
                 <w:b w:val="0"/>
-                <w:i w:val="0"/>
                 <w:sz w:val="22"/>
               </w:rPr>
-              <w:t>tier</w:t>
+              <w:t>±1 tier</w:t>
             </w:r>
           </w:p>
         </w:tc>
@@ -2782,10 +2998,9 @@
             <w:r>
               <w:rPr>
                 <w:b w:val="0"/>
-                <w:i w:val="0"/>
                 <w:sz w:val="22"/>
               </w:rPr>
-              <w:t>196</w:t>
+              <w:t>196 (Tier 3)</w:t>
             </w:r>
           </w:p>
         </w:tc>
@@ -2801,10 +3016,9 @@
             <w:r>
               <w:rPr>
                 <w:b w:val="0"/>
-                <w:i w:val="0"/>
                 <w:sz w:val="22"/>
               </w:rPr>
-              <w:t>112</w:t>
+              <w:t>112 (Tier 1)</w:t>
             </w:r>
           </w:p>
         </w:tc>
@@ -2822,7 +3036,6 @@
             <w:r>
               <w:rPr>
                 <w:b w:val="0"/>
-                <w:i w:val="0"/>
                 <w:sz w:val="22"/>
               </w:rPr>
               <w:t>Risk domain</w:t>
@@ -2841,7 +3054,7 @@
             <w:r>
               <w:rPr>
                 <w:b w:val="0"/>
-                <w:i w:val="0"/>
+                <w:color w:val="006600"/>
                 <w:sz w:val="22"/>
               </w:rPr>
               <w:t>1.00</w:t>
@@ -2860,7 +3073,6 @@
             <w:r>
               <w:rPr>
                 <w:b w:val="0"/>
-                <w:i w:val="0"/>
                 <w:sz w:val="22"/>
               </w:rPr>
               <w:t>exact</w:t>
@@ -2879,7 +3091,6 @@
             <w:r>
               <w:rPr>
                 <w:b w:val="0"/>
-                <w:i w:val="0"/>
                 <w:sz w:val="22"/>
               </w:rPr>
               <w:t>Study Risks</w:t>
@@ -2898,7 +3109,6 @@
             <w:r>
               <w:rPr>
                 <w:b w:val="0"/>
-                <w:i w:val="0"/>
                 <w:sz w:val="22"/>
               </w:rPr>
               <w:t>Study Risks</w:t>
@@ -2919,7 +3129,6 @@
             <w:r>
               <w:rPr>
                 <w:b w:val="0"/>
-                <w:i w:val="0"/>
                 <w:sz w:val="22"/>
               </w:rPr>
               <w:t>Primary control type</w:t>
@@ -2938,7 +3147,7 @@
             <w:r>
               <w:rPr>
                 <w:b w:val="0"/>
-                <w:i w:val="0"/>
+                <w:color w:val="C00000"/>
                 <w:sz w:val="22"/>
               </w:rPr>
               <w:t>0.00</w:t>
@@ -2957,7 +3166,6 @@
             <w:r>
               <w:rPr>
                 <w:b w:val="0"/>
-                <w:i w:val="0"/>
                 <w:sz w:val="22"/>
               </w:rPr>
               <w:t>miss</w:t>
@@ -2976,7 +3184,6 @@
             <w:r>
               <w:rPr>
                 <w:b w:val="0"/>
-                <w:i w:val="0"/>
                 <w:sz w:val="22"/>
               </w:rPr>
               <w:t>Edit Checks</w:t>
@@ -2995,7 +3202,6 @@
             <w:r>
               <w:rPr>
                 <w:b w:val="0"/>
-                <w:i w:val="0"/>
                 <w:sz w:val="22"/>
               </w:rPr>
               <w:t>Quality Tolerance Limit (QTL)</w:t>
@@ -3008,120 +3214,229 @@
     <w:p/>
     <w:p>
       <w:pPr>
-        <w:spacing w:lineRule="auto" w:line="276" w:after="120"/>
+        <w:pStyle w:val="Heading2"/>
       </w:pPr>
       <w:r>
-        <w:rPr>
-          <w:b/>
-          <w:i w:val="0"/>
-          <w:sz w:val="22"/>
-        </w:rPr>
-        <w:t>Intelligence block</w:t>
+        <w:t>Risk 3 — Enrollment Criteria [SR-02218]</w:t>
       </w:r>
     </w:p>
     <w:p>
       <w:pPr>
-        <w:spacing w:lineRule="auto" w:line="276" w:after="120"/>
+        <w:pStyle w:val="Heading3"/>
       </w:pPr>
       <w:r>
-        <w:rPr>
-          <w:b w:val="0"/>
-          <w:i w:val="0"/>
-          <w:sz w:val="22"/>
-        </w:rPr>
-        <w:t>Benchmark occurrence rate: 50% | Source: 1/2 studies</w:t>
-        <w:br/>
-        <w:br/>
-        <w:t>RPN confidence: LOW | USDM traceability: FULL</w:t>
+        <w:t>Risk match information</w:t>
       </w:r>
     </w:p>
+    <w:tbl>
+      <w:tblPr>
+        <w:tblStyle w:val="TableGrid"/>
+        <w:tblW w:type="auto" w:w="0"/>
+        <w:tblLayout w:type="fixed"/>
+        <w:tblLook w:firstColumn="1" w:firstRow="1" w:lastColumn="0" w:lastRow="0" w:noHBand="0" w:noVBand="1" w:val="04A0"/>
+      </w:tblPr>
+      <w:tblGrid>
+        <w:gridCol w:w="4320"/>
+        <w:gridCol w:w="4320"/>
+      </w:tblGrid>
+      <w:tr>
+        <w:tc>
+          <w:tcPr>
+            <w:tcW w:type="dxa" w:w="2088"/>
+            <w:shd w:fill="4472C4"/>
+          </w:tcPr>
+          <w:p>
+            <w:pPr>
+              <w:spacing w:lineRule="auto" w:line="276" w:after="120"/>
+            </w:pPr>
+            <w:r/>
+            <w:r>
+              <w:rPr>
+                <w:b/>
+                <w:color w:val="FFFFFF"/>
+                <w:sz w:val="22"/>
+              </w:rPr>
+              <w:t>Field</w:t>
+            </w:r>
+          </w:p>
+        </w:tc>
+        <w:tc>
+          <w:tcPr>
+            <w:tcW w:type="dxa" w:w="7272"/>
+            <w:shd w:fill="4472C4"/>
+          </w:tcPr>
+          <w:p>
+            <w:pPr>
+              <w:spacing w:lineRule="auto" w:line="276" w:after="120"/>
+            </w:pPr>
+            <w:r/>
+            <w:r>
+              <w:rPr>
+                <w:b/>
+                <w:color w:val="FFFFFF"/>
+                <w:sz w:val="22"/>
+              </w:rPr>
+              <w:t>Value</w:t>
+            </w:r>
+          </w:p>
+        </w:tc>
+      </w:tr>
+      <w:tr>
+        <w:tc>
+          <w:tcPr>
+            <w:tcW w:type="dxa" w:w="4320"/>
+          </w:tcPr>
+          <w:p>
+            <w:pPr>
+              <w:spacing w:lineRule="auto" w:line="276" w:after="120"/>
+            </w:pPr>
+            <w:r/>
+            <w:r>
+              <w:rPr>
+                <w:b/>
+                <w:sz w:val="22"/>
+              </w:rPr>
+              <w:t>Risk Name Match</w:t>
+            </w:r>
+          </w:p>
+        </w:tc>
+        <w:tc>
+          <w:tcPr>
+            <w:tcW w:type="dxa" w:w="4320"/>
+          </w:tcPr>
+          <w:p>
+            <w:pPr>
+              <w:spacing w:lineRule="auto" w:line="276" w:after="120"/>
+            </w:pPr>
+            <w:r/>
+            <w:r>
+              <w:rPr>
+                <w:b w:val="0"/>
+                <w:color w:val="C00000"/>
+                <w:sz w:val="22"/>
+              </w:rPr>
+              <w:t>— MISS — not generated for this ground-truth row.</w:t>
+            </w:r>
+          </w:p>
+        </w:tc>
+      </w:tr>
+      <w:tr>
+        <w:tc>
+          <w:tcPr>
+            <w:tcW w:type="dxa" w:w="4320"/>
+          </w:tcPr>
+          <w:p>
+            <w:pPr>
+              <w:spacing w:lineRule="auto" w:line="276" w:after="120"/>
+            </w:pPr>
+            <w:r/>
+            <w:r>
+              <w:rPr>
+                <w:b/>
+                <w:sz w:val="22"/>
+              </w:rPr>
+              <w:t>Match Status</w:t>
+            </w:r>
+          </w:p>
+        </w:tc>
+        <w:tc>
+          <w:tcPr>
+            <w:tcW w:type="dxa" w:w="4320"/>
+          </w:tcPr>
+          <w:p>
+            <w:pPr>
+              <w:spacing w:lineRule="auto" w:line="276" w:after="120"/>
+            </w:pPr>
+            <w:r/>
+            <w:r>
+              <w:rPr>
+                <w:b w:val="0"/>
+                <w:color w:val="C00000"/>
+                <w:sz w:val="22"/>
+              </w:rPr>
+              <w:t>Not generated (see M1 misses).</w:t>
+            </w:r>
+          </w:p>
+        </w:tc>
+      </w:tr>
+      <w:tr>
+        <w:tc>
+          <w:tcPr>
+            <w:tcW w:type="dxa" w:w="4320"/>
+          </w:tcPr>
+          <w:p>
+            <w:pPr>
+              <w:spacing w:lineRule="auto" w:line="276" w:after="120"/>
+            </w:pPr>
+            <w:r/>
+            <w:r>
+              <w:rPr>
+                <w:b/>
+                <w:sz w:val="22"/>
+              </w:rPr>
+              <w:t>Ground Truth ID</w:t>
+            </w:r>
+          </w:p>
+        </w:tc>
+        <w:tc>
+          <w:tcPr>
+            <w:tcW w:type="dxa" w:w="4320"/>
+          </w:tcPr>
+          <w:p>
+            <w:pPr>
+              <w:spacing w:lineRule="auto" w:line="276" w:after="120"/>
+            </w:pPr>
+            <w:r/>
+            <w:r>
+              <w:rPr>
+                <w:b w:val="0"/>
+                <w:sz w:val="22"/>
+              </w:rPr>
+              <w:t>SR-02218</w:t>
+            </w:r>
+          </w:p>
+        </w:tc>
+      </w:tr>
+      <w:tr>
+        <w:tc>
+          <w:tcPr>
+            <w:tcW w:type="dxa" w:w="4320"/>
+          </w:tcPr>
+          <w:p>
+            <w:pPr>
+              <w:spacing w:lineRule="auto" w:line="276" w:after="120"/>
+            </w:pPr>
+            <w:r/>
+            <w:r>
+              <w:rPr>
+                <w:b/>
+                <w:sz w:val="22"/>
+              </w:rPr>
+              <w:t>Risk domain (GT)</w:t>
+            </w:r>
+          </w:p>
+        </w:tc>
+        <w:tc>
+          <w:tcPr>
+            <w:tcW w:type="dxa" w:w="4320"/>
+          </w:tcPr>
+          <w:p>
+            <w:pPr>
+              <w:spacing w:lineRule="auto" w:line="276" w:after="120"/>
+            </w:pPr>
+            <w:r/>
+            <w:r>
+              <w:rPr>
+                <w:b w:val="0"/>
+                <w:sz w:val="22"/>
+              </w:rPr>
+              <w:t>Study Risks</w:t>
+            </w:r>
+          </w:p>
+        </w:tc>
+      </w:tr>
+    </w:tbl>
     <w:p/>
-    <w:p>
-      <w:pPr>
-        <w:pStyle w:val="Heading2"/>
-      </w:pPr>
-      <w:r>
-        <w:t>Risk 3 — Enrollment Criteria [—]</w:t>
-      </w:r>
-    </w:p>
-    <w:p>
-      <w:pPr>
-        <w:spacing w:lineRule="auto" w:line="276" w:after="120"/>
-      </w:pPr>
-      <w:r>
-        <w:rPr>
-          <w:b/>
-          <w:i w:val="0"/>
-          <w:sz w:val="22"/>
-        </w:rPr>
-        <w:t>Risk Name Match</w:t>
-      </w:r>
-    </w:p>
-    <w:p>
-      <w:pPr>
-        <w:spacing w:lineRule="auto" w:line="276" w:after="120"/>
-      </w:pPr>
-      <w:r>
-        <w:rPr>
-          <w:b w:val="0"/>
-          <w:i w:val="0"/>
-          <w:sz w:val="22"/>
-        </w:rPr>
-        <w:t>— **MISS** — not generated under this name.</w:t>
-      </w:r>
-    </w:p>
-    <w:p>
-      <w:pPr>
-        <w:spacing w:lineRule="auto" w:line="276" w:after="120"/>
-      </w:pPr>
-      <w:r>
-        <w:rPr>
-          <w:b/>
-          <w:i w:val="0"/>
-          <w:sz w:val="22"/>
-        </w:rPr>
-        <w:t>Match Status</w:t>
-      </w:r>
-    </w:p>
-    <w:p>
-      <w:pPr>
-        <w:spacing w:lineRule="auto" w:line="276" w:after="120"/>
-      </w:pPr>
-      <w:r>
-        <w:rPr>
-          <w:b w:val="0"/>
-          <w:i w:val="0"/>
-          <w:sz w:val="22"/>
-        </w:rPr>
-        <w:t>Not generated (see M1 misses).</w:t>
-      </w:r>
-    </w:p>
-    <w:p>
-      <w:pPr>
-        <w:spacing w:lineRule="auto" w:line="276" w:after="120"/>
-      </w:pPr>
-      <w:r>
-        <w:rPr>
-          <w:b/>
-          <w:i w:val="0"/>
-          <w:sz w:val="22"/>
-        </w:rPr>
-        <w:t>Ground Truth ID</w:t>
-      </w:r>
-    </w:p>
-    <w:p>
-      <w:pPr>
-        <w:spacing w:lineRule="auto" w:line="276" w:after="120"/>
-      </w:pPr>
-      <w:r>
-        <w:rPr>
-          <w:b w:val="0"/>
-          <w:i w:val="0"/>
-          <w:sz w:val="22"/>
-        </w:rPr>
-        <w:t>SR-02218</w:t>
-      </w:r>
-    </w:p>
     <w:p/>
     <w:p/>
     <w:p>
@@ -3142,7 +3457,7 @@
           <w:i w:val="0"/>
           <w:sz w:val="22"/>
         </w:rPr>
-        <w:t>5 critical factors expected for immunology_phase_iii bucket. 5 matched exactly.</w:t>
+        <w:t>5 critical factors expected for immunology_phase_iii bucket. 5 name matches; F1=1.0, P=1.0, R=1.0.</w:t>
       </w:r>
     </w:p>
     <w:p/>
@@ -3163,7 +3478,7 @@
         <w:tc>
           <w:tcPr>
             <w:tcW w:type="dxa" w:w="2016"/>
-            <w:shd w:fill="D9D9D9"/>
+            <w:shd w:fill="4472C4"/>
           </w:tcPr>
           <w:p>
             <w:pPr>
@@ -3174,6 +3489,7 @@
               <w:rPr>
                 <w:b/>
                 <w:i w:val="0"/>
+                <w:color w:val="FFFFFF"/>
                 <w:sz w:val="22"/>
               </w:rPr>
               <w:t>Critical Factor</w:t>
@@ -3183,7 +3499,7 @@
         <w:tc>
           <w:tcPr>
             <w:tcW w:type="dxa" w:w="792"/>
-            <w:shd w:fill="D9D9D9"/>
+            <w:shd w:fill="4472C4"/>
           </w:tcPr>
           <w:p>
             <w:pPr>
@@ -3194,6 +3510,7 @@
               <w:rPr>
                 <w:b/>
                 <w:i w:val="0"/>
+                <w:color w:val="FFFFFF"/>
                 <w:sz w:val="22"/>
               </w:rPr>
               <w:t>Match</w:t>
@@ -3203,7 +3520,7 @@
         <w:tc>
           <w:tcPr>
             <w:tcW w:type="dxa" w:w="3312"/>
-            <w:shd w:fill="D9D9D9"/>
+            <w:shd w:fill="4472C4"/>
           </w:tcPr>
           <w:p>
             <w:pPr>
@@ -3214,6 +3531,7 @@
               <w:rPr>
                 <w:b/>
                 <w:i w:val="0"/>
+                <w:color w:val="FFFFFF"/>
                 <w:sz w:val="22"/>
               </w:rPr>
               <w:t>Critical Data</w:t>
@@ -3223,7 +3541,7 @@
         <w:tc>
           <w:tcPr>
             <w:tcW w:type="dxa" w:w="3312"/>
-            <w:shd w:fill="D9D9D9"/>
+            <w:shd w:fill="4472C4"/>
           </w:tcPr>
           <w:p>
             <w:pPr>
@@ -3234,6 +3552,7 @@
               <w:rPr>
                 <w:b/>
                 <w:i w:val="0"/>
+                <w:color w:val="FFFFFF"/>
                 <w:sz w:val="22"/>
               </w:rPr>
               <w:t>Critical Process</w:t>
@@ -3652,7 +3971,20 @@
           <w:i w:val="0"/>
           <w:sz w:val="28"/>
         </w:rPr>
-        <w:t>ZERO HALLUCINATIONS FOUND ✓</w:t>
+        <w:t>ZERO PROVENANCE DEFECTS (M4) ✓</w:t>
+      </w:r>
+    </w:p>
+    <w:p>
+      <w:pPr>
+        <w:spacing w:lineRule="auto" w:line="276" w:after="120"/>
+      </w:pPr>
+      <w:r>
+        <w:rPr>
+          <w:b w:val="0"/>
+          <w:i w:val="0"/>
+          <w:sz w:val="22"/>
+        </w:rPr>
+        <w:t>Semantic unmatched generated risks (M1; not summed into defect count above): 3. Extra critical factors when benchmark expects zero (M3): 0.</w:t>
       </w:r>
     </w:p>
     <w:p/>
@@ -3671,7 +4003,7 @@
         <w:tc>
           <w:tcPr>
             <w:tcW w:type="dxa" w:w="5040"/>
-            <w:shd w:fill="D9D9D9"/>
+            <w:shd w:fill="4472C4"/>
           </w:tcPr>
           <w:p>
             <w:pPr>
@@ -3682,6 +4014,7 @@
               <w:rPr>
                 <w:b/>
                 <w:i w:val="0"/>
+                <w:color w:val="FFFFFF"/>
                 <w:sz w:val="22"/>
               </w:rPr>
               <w:t>Check</w:t>
@@ -3691,7 +4024,7 @@
         <w:tc>
           <w:tcPr>
             <w:tcW w:type="dxa" w:w="3600"/>
-            <w:shd w:fill="D9D9D9"/>
+            <w:shd w:fill="4472C4"/>
           </w:tcPr>
           <w:p>
             <w:pPr>
@@ -3702,6 +4035,7 @@
               <w:rPr>
                 <w:b/>
                 <w:i w:val="0"/>
+                <w:color w:val="FFFFFF"/>
                 <w:sz w:val="22"/>
               </w:rPr>
               <w:t>Result</w:t>
@@ -3890,7 +4224,7 @@
           <w:i w:val="0"/>
           <w:sz w:val="22"/>
         </w:rPr>
-        <w:t>No near misses found. All 3 ground-truth risk names were either matched verbatim or missed outright (Levenshtein logging empty).</w:t>
+        <w:t>No near misses found. All 3 ground-truth risk rows for this protocol were either exact-name matched or missed outright (Levenshtein logging empty).</w:t>
       </w:r>
     </w:p>
     <w:p/>
@@ -3918,7 +4252,7 @@
         <w:tc>
           <w:tcPr>
             <w:tcW w:type="dxa" w:w="2592"/>
-            <w:shd w:fill="D9D9D9"/>
+            <w:shd w:fill="4472C4"/>
           </w:tcPr>
           <w:p>
             <w:pPr>
@@ -3929,6 +4263,7 @@
               <w:rPr>
                 <w:b/>
                 <w:i w:val="0"/>
+                <w:color w:val="FFFFFF"/>
                 <w:sz w:val="22"/>
               </w:rPr>
               <w:t>Domain</w:t>
@@ -3938,7 +4273,7 @@
         <w:tc>
           <w:tcPr>
             <w:tcW w:type="dxa" w:w="1728"/>
-            <w:shd w:fill="D9D9D9"/>
+            <w:shd w:fill="4472C4"/>
           </w:tcPr>
           <w:p>
             <w:pPr>
@@ -3949,6 +4284,7 @@
               <w:rPr>
                 <w:b/>
                 <w:i w:val="0"/>
+                <w:color w:val="FFFFFF"/>
                 <w:sz w:val="22"/>
               </w:rPr>
               <w:t>Generated</w:t>
@@ -3958,7 +4294,7 @@
         <w:tc>
           <w:tcPr>
             <w:tcW w:type="dxa" w:w="1728"/>
-            <w:shd w:fill="D9D9D9"/>
+            <w:shd w:fill="4472C4"/>
           </w:tcPr>
           <w:p>
             <w:pPr>
@@ -3969,6 +4305,7 @@
               <w:rPr>
                 <w:b/>
                 <w:i w:val="0"/>
+                <w:color w:val="FFFFFF"/>
                 <w:sz w:val="22"/>
               </w:rPr>
               <w:t>Ground Truth</w:t>
@@ -4165,7 +4502,7 @@
           <w:i w:val="0"/>
           <w:sz w:val="22"/>
         </w:rPr>
-        <w:t>If generated counts are zero for all three domains, this matches typical B7981027 ground truth (study risks only). Confirm against protocol-specific GT when available.</w:t>
+        <w:t>Ground Truth counts are from risk_profile_ground_truth.csv for this study_id only. Vendor / site / other columns show how many benchmark rows fall in each domain when rows exist.</w:t>
       </w:r>
     </w:p>
     <w:p/>

</xml_diff>